<commit_message>
Fix U4 exam clarity: Word KaiTi body, no SimSun, bump cache.
Co-authored-by: Cursor <cursoragent@cursor.com>
</commit_message>
<xml_diff>
--- a/printables/full/u04-full.docx
+++ b/printables/full/u04-full.docx
@@ -1682,7 +1682,7 @@
       </w:pPr>
       <w:r>
         <w:rPr>
-          <w:rFonts w:ascii="宋体" w:hAnsi="宋体" w:eastAsia="宋体"/>
+          <w:rFonts w:ascii="楷体" w:hAnsi="楷体" w:eastAsia="楷体"/>
           <w:b w:val="0"/>
           <w:color w:val="000000"/>
           <w:sz w:val="30"/>
@@ -1696,7 +1696,7 @@
       </w:pPr>
       <w:r>
         <w:rPr>
-          <w:rFonts w:ascii="宋体" w:hAnsi="宋体" w:eastAsia="宋体"/>
+          <w:rFonts w:ascii="楷体" w:hAnsi="楷体" w:eastAsia="楷体"/>
           <w:b w:val="0"/>
           <w:color w:val="000000"/>
           <w:sz w:val="30"/>
@@ -1851,7 +1851,7 @@
       </w:pPr>
       <w:r>
         <w:rPr>
-          <w:rFonts w:ascii="宋体" w:hAnsi="宋体" w:eastAsia="宋体"/>
+          <w:rFonts w:ascii="楷体" w:hAnsi="楷体" w:eastAsia="楷体"/>
           <w:b w:val="0"/>
           <w:color w:val="000000"/>
           <w:sz w:val="30"/>
@@ -1865,7 +1865,7 @@
       </w:pPr>
       <w:r>
         <w:rPr>
-          <w:rFonts w:ascii="宋体" w:hAnsi="宋体" w:eastAsia="宋体"/>
+          <w:rFonts w:ascii="楷体" w:hAnsi="楷体" w:eastAsia="楷体"/>
           <w:b w:val="0"/>
           <w:color w:val="000000"/>
           <w:sz w:val="30"/>
@@ -1915,10 +1915,10 @@
             <w:r/>
             <w:r>
               <w:rPr>
-                <w:rFonts w:ascii="宋体" w:hAnsi="宋体" w:eastAsia="宋体"/>
+                <w:rFonts w:ascii="黑体" w:hAnsi="黑体" w:eastAsia="黑体"/>
                 <w:b/>
-                <w:color w:val="1C1917"/>
-                <w:sz w:val="22"/>
+                <w:color w:val="000000"/>
+                <w:sz w:val="24"/>
               </w:rPr>
               <w:t>故事名称</w:t>
             </w:r>
@@ -1938,10 +1938,10 @@
             <w:r/>
             <w:r>
               <w:rPr>
-                <w:rFonts w:ascii="宋体" w:hAnsi="宋体" w:eastAsia="宋体"/>
+                <w:rFonts w:ascii="楷体" w:hAnsi="楷体" w:eastAsia="楷体"/>
                 <w:b w:val="0"/>
-                <w:color w:val="1C1917"/>
-                <w:sz w:val="22"/>
+                <w:color w:val="000000"/>
+                <w:sz w:val="24"/>
               </w:rPr>
               <w:br/>
             </w:r>
@@ -1966,10 +1966,10 @@
             <w:r/>
             <w:r>
               <w:rPr>
-                <w:rFonts w:ascii="宋体" w:hAnsi="宋体" w:eastAsia="宋体"/>
+                <w:rFonts w:ascii="黑体" w:hAnsi="黑体" w:eastAsia="黑体"/>
                 <w:b/>
-                <w:color w:val="1C1917"/>
-                <w:sz w:val="22"/>
+                <w:color w:val="000000"/>
+                <w:sz w:val="24"/>
               </w:rPr>
               <w:t>主人公</w:t>
             </w:r>
@@ -1989,10 +1989,10 @@
             <w:r/>
             <w:r>
               <w:rPr>
-                <w:rFonts w:ascii="宋体" w:hAnsi="宋体" w:eastAsia="宋体"/>
+                <w:rFonts w:ascii="楷体" w:hAnsi="楷体" w:eastAsia="楷体"/>
                 <w:b w:val="0"/>
-                <w:color w:val="1C1917"/>
-                <w:sz w:val="22"/>
+                <w:color w:val="000000"/>
+                <w:sz w:val="24"/>
               </w:rPr>
               <w:br/>
             </w:r>
@@ -2017,10 +2017,10 @@
             <w:r/>
             <w:r>
               <w:rPr>
-                <w:rFonts w:ascii="宋体" w:hAnsi="宋体" w:eastAsia="宋体"/>
+                <w:rFonts w:ascii="黑体" w:hAnsi="黑体" w:eastAsia="黑体"/>
                 <w:b/>
-                <w:color w:val="1C1917"/>
-                <w:sz w:val="22"/>
+                <w:color w:val="000000"/>
+                <w:sz w:val="24"/>
               </w:rPr>
               <w:t>故事中最神奇的地方</w:t>
             </w:r>
@@ -2040,10 +2040,10 @@
             <w:r/>
             <w:r>
               <w:rPr>
-                <w:rFonts w:ascii="宋体" w:hAnsi="宋体" w:eastAsia="宋体"/>
+                <w:rFonts w:ascii="楷体" w:hAnsi="楷体" w:eastAsia="楷体"/>
                 <w:b w:val="0"/>
-                <w:color w:val="1C1917"/>
-                <w:sz w:val="22"/>
+                <w:color w:val="000000"/>
+                <w:sz w:val="24"/>
               </w:rPr>
               <w:br/>
             </w:r>
@@ -2068,10 +2068,10 @@
             <w:r/>
             <w:r>
               <w:rPr>
-                <w:rFonts w:ascii="宋体" w:hAnsi="宋体" w:eastAsia="宋体"/>
+                <w:rFonts w:ascii="黑体" w:hAnsi="黑体" w:eastAsia="黑体"/>
                 <w:b/>
-                <w:color w:val="1C1917"/>
-                <w:sz w:val="22"/>
+                <w:color w:val="000000"/>
+                <w:sz w:val="24"/>
               </w:rPr>
               <w:t>我的阅读感受</w:t>
             </w:r>
@@ -2091,10 +2091,10 @@
             <w:r/>
             <w:r>
               <w:rPr>
-                <w:rFonts w:ascii="宋体" w:hAnsi="宋体" w:eastAsia="宋体"/>
+                <w:rFonts w:ascii="楷体" w:hAnsi="楷体" w:eastAsia="楷体"/>
                 <w:b w:val="0"/>
-                <w:color w:val="1C1917"/>
-                <w:sz w:val="22"/>
+                <w:color w:val="000000"/>
+                <w:sz w:val="24"/>
               </w:rPr>
               <w:br/>
             </w:r>
@@ -2127,7 +2127,7 @@
       </w:pPr>
       <w:r>
         <w:rPr>
-          <w:rFonts w:ascii="宋体" w:hAnsi="宋体" w:eastAsia="宋体"/>
+          <w:rFonts w:ascii="楷体" w:hAnsi="楷体" w:eastAsia="楷体"/>
           <w:b w:val="0"/>
           <w:color w:val="000000"/>
           <w:sz w:val="30"/>
@@ -2141,7 +2141,7 @@
       </w:pPr>
       <w:r>
         <w:rPr>
-          <w:rFonts w:ascii="宋体" w:hAnsi="宋体" w:eastAsia="宋体"/>
+          <w:rFonts w:ascii="楷体" w:hAnsi="楷体" w:eastAsia="楷体"/>
           <w:b w:val="0"/>
           <w:color w:val="000000"/>
           <w:sz w:val="30"/>
@@ -2170,7 +2170,7 @@
     </w:pPr>
     <w:r>
       <w:rPr>
-        <w:rFonts w:ascii="宋体" w:hAnsi="宋体" w:eastAsia="宋体"/>
+        <w:rFonts w:ascii="楷体" w:hAnsi="楷体" w:eastAsia="楷体"/>
         <w:b w:val="0"/>
         <w:color w:val="000000"/>
         <w:sz w:val="18"/>
@@ -2191,7 +2191,7 @@
     </w:pPr>
     <w:r>
       <w:rPr>
-        <w:rFonts w:ascii="宋体" w:hAnsi="宋体" w:eastAsia="宋体"/>
+        <w:rFonts w:ascii="楷体" w:hAnsi="楷体" w:eastAsia="楷体"/>
         <w:b w:val="0"/>
         <w:color w:val="000000"/>
         <w:sz w:val="18"/>
@@ -2212,7 +2212,7 @@
     </w:pPr>
     <w:r>
       <w:rPr>
-        <w:rFonts w:ascii="宋体" w:hAnsi="宋体" w:eastAsia="宋体"/>
+        <w:rFonts w:ascii="楷体" w:hAnsi="楷体" w:eastAsia="楷体"/>
         <w:b w:val="0"/>
         <w:color w:val="000000"/>
         <w:sz w:val="18"/>
@@ -2233,7 +2233,7 @@
     </w:pPr>
     <w:r>
       <w:rPr>
-        <w:rFonts w:ascii="宋体" w:hAnsi="宋体" w:eastAsia="宋体"/>
+        <w:rFonts w:ascii="楷体" w:hAnsi="楷体" w:eastAsia="楷体"/>
         <w:b w:val="0"/>
         <w:color w:val="000000"/>
         <w:sz w:val="18"/>
@@ -2608,8 +2608,9 @@
     <w:qFormat/>
     <w:rsid w:val="00FC693F"/>
     <w:rPr>
-      <w:rFonts w:ascii="宋体" w:hAnsi="宋体" w:eastAsia="宋体"/>
-      <w:sz w:val="21"/>
+      <w:rFonts w:ascii="楷体" w:hAnsi="楷体" w:eastAsia="楷体" w:cs="楷体"/>
+      <w:color w:val="000000"/>
+      <w:sz w:val="26"/>
     </w:rPr>
   </w:style>
   <w:style w:type="paragraph" w:styleId="Header">

</xml_diff>

<commit_message>
Switch U4 exam fonts to Songti body + Heiti titles and bump cache.
Aligns printable PDFs with the global exam-from-photo standard for Pages deploy.

Co-authored-by: Cursor <cursoragent@cursor.com>
</commit_message>
<xml_diff>
--- a/printables/full/u04-full.docx
+++ b/printables/full/u04-full.docx
@@ -23,7 +23,7 @@
       </w:pPr>
       <w:r>
         <w:rPr>
-          <w:rFonts w:ascii="楷体" w:hAnsi="楷体" w:eastAsia="楷体"/>
+          <w:rFonts w:ascii="宋体" w:hAnsi="宋体" w:eastAsia="宋体"/>
           <w:b w:val="0"/>
           <w:color w:val="000000"/>
           <w:sz w:val="26"/>
@@ -83,7 +83,7 @@
             <w:r/>
             <w:r>
               <w:rPr>
-                <w:rFonts w:ascii="楷体" w:hAnsi="楷体" w:eastAsia="楷体"/>
+                <w:rFonts w:ascii="宋体" w:hAnsi="宋体" w:eastAsia="宋体"/>
                 <w:b w:val="0"/>
                 <w:color w:val="000000"/>
                 <w:sz w:val="26"/>
@@ -106,7 +106,7 @@
             <w:r/>
             <w:r>
               <w:rPr>
-                <w:rFonts w:ascii="Times New Roman" w:hAnsi="Times New Roman" w:eastAsia="楷体"/>
+                <w:rFonts w:ascii="Times New Roman" w:hAnsi="Times New Roman" w:eastAsia="宋体"/>
                 <w:b w:val="0"/>
                 <w:color w:val="000000"/>
                 <w:sz w:val="24"/>
@@ -249,7 +249,7 @@
             <w:r/>
             <w:r>
               <w:rPr>
-                <w:rFonts w:ascii="楷体" w:hAnsi="楷体" w:eastAsia="楷体"/>
+                <w:rFonts w:ascii="宋体" w:hAnsi="宋体" w:eastAsia="宋体"/>
                 <w:b w:val="0"/>
                 <w:color w:val="000000"/>
                 <w:sz w:val="26"/>
@@ -303,7 +303,7 @@
             <w:r/>
             <w:r>
               <w:rPr>
-                <w:rFonts w:ascii="楷体" w:hAnsi="楷体" w:eastAsia="楷体"/>
+                <w:rFonts w:ascii="宋体" w:hAnsi="宋体" w:eastAsia="宋体"/>
                 <w:b w:val="0"/>
                 <w:color w:val="000000"/>
                 <w:sz w:val="26"/>
@@ -326,7 +326,7 @@
             <w:r/>
             <w:r>
               <w:rPr>
-                <w:rFonts w:ascii="Times New Roman" w:hAnsi="Times New Roman" w:eastAsia="楷体"/>
+                <w:rFonts w:ascii="Times New Roman" w:hAnsi="Times New Roman" w:eastAsia="宋体"/>
                 <w:b w:val="0"/>
                 <w:color w:val="000000"/>
                 <w:sz w:val="24"/>
@@ -565,7 +565,7 @@
             <w:r/>
             <w:r>
               <w:rPr>
-                <w:rFonts w:ascii="楷体" w:hAnsi="楷体" w:eastAsia="楷体"/>
+                <w:rFonts w:ascii="宋体" w:hAnsi="宋体" w:eastAsia="宋体"/>
                 <w:b w:val="0"/>
                 <w:color w:val="000000"/>
                 <w:sz w:val="26"/>
@@ -619,7 +619,7 @@
             <w:r/>
             <w:r>
               <w:rPr>
-                <w:rFonts w:ascii="楷体" w:hAnsi="楷体" w:eastAsia="楷体"/>
+                <w:rFonts w:ascii="宋体" w:hAnsi="宋体" w:eastAsia="宋体"/>
                 <w:b w:val="0"/>
                 <w:color w:val="000000"/>
                 <w:sz w:val="26"/>
@@ -642,7 +642,7 @@
             <w:r/>
             <w:r>
               <w:rPr>
-                <w:rFonts w:ascii="Times New Roman" w:hAnsi="Times New Roman" w:eastAsia="楷体"/>
+                <w:rFonts w:ascii="Times New Roman" w:hAnsi="Times New Roman" w:eastAsia="宋体"/>
                 <w:b w:val="0"/>
                 <w:color w:val="000000"/>
                 <w:sz w:val="24"/>
@@ -785,7 +785,7 @@
             <w:r/>
             <w:r>
               <w:rPr>
-                <w:rFonts w:ascii="楷体" w:hAnsi="楷体" w:eastAsia="楷体"/>
+                <w:rFonts w:ascii="宋体" w:hAnsi="宋体" w:eastAsia="宋体"/>
                 <w:b w:val="0"/>
                 <w:color w:val="000000"/>
                 <w:sz w:val="26"/>
@@ -821,7 +821,7 @@
       </w:pPr>
       <w:r>
         <w:rPr>
-          <w:rFonts w:ascii="楷体" w:hAnsi="楷体" w:eastAsia="楷体"/>
+          <w:rFonts w:ascii="宋体" w:hAnsi="宋体" w:eastAsia="宋体"/>
           <w:b w:val="0"/>
           <w:color w:val="000000"/>
           <w:sz w:val="26"/>
@@ -835,7 +835,7 @@
       </w:pPr>
       <w:r>
         <w:rPr>
-          <w:rFonts w:ascii="楷体" w:hAnsi="楷体" w:eastAsia="楷体"/>
+          <w:rFonts w:ascii="宋体" w:hAnsi="宋体" w:eastAsia="宋体"/>
           <w:b w:val="0"/>
           <w:color w:val="000000"/>
           <w:sz w:val="26"/>
@@ -849,7 +849,7 @@
       </w:pPr>
       <w:r>
         <w:rPr>
-          <w:rFonts w:ascii="楷体" w:hAnsi="楷体" w:eastAsia="楷体"/>
+          <w:rFonts w:ascii="宋体" w:hAnsi="宋体" w:eastAsia="宋体"/>
           <w:b w:val="0"/>
           <w:color w:val="000000"/>
           <w:sz w:val="26"/>
@@ -863,7 +863,7 @@
       </w:pPr>
       <w:r>
         <w:rPr>
-          <w:rFonts w:ascii="楷体" w:hAnsi="楷体" w:eastAsia="楷体"/>
+          <w:rFonts w:ascii="宋体" w:hAnsi="宋体" w:eastAsia="宋体"/>
           <w:b w:val="0"/>
           <w:color w:val="000000"/>
           <w:sz w:val="26"/>
@@ -877,7 +877,7 @@
       </w:pPr>
       <w:r>
         <w:rPr>
-          <w:rFonts w:ascii="楷体" w:hAnsi="楷体" w:eastAsia="楷体"/>
+          <w:rFonts w:ascii="宋体" w:hAnsi="宋体" w:eastAsia="宋体"/>
           <w:b w:val="0"/>
           <w:color w:val="000000"/>
           <w:sz w:val="26"/>
@@ -891,7 +891,7 @@
       </w:pPr>
       <w:r>
         <w:rPr>
-          <w:rFonts w:ascii="楷体" w:hAnsi="楷体" w:eastAsia="楷体"/>
+          <w:rFonts w:ascii="宋体" w:hAnsi="宋体" w:eastAsia="宋体"/>
           <w:b w:val="0"/>
           <w:color w:val="000000"/>
           <w:sz w:val="26"/>
@@ -905,7 +905,7 @@
       </w:pPr>
       <w:r>
         <w:rPr>
-          <w:rFonts w:ascii="楷体" w:hAnsi="楷体" w:eastAsia="楷体"/>
+          <w:rFonts w:ascii="宋体" w:hAnsi="宋体" w:eastAsia="宋体"/>
           <w:b w:val="0"/>
           <w:color w:val="000000"/>
           <w:sz w:val="26"/>
@@ -919,7 +919,7 @@
       </w:pPr>
       <w:r>
         <w:rPr>
-          <w:rFonts w:ascii="楷体" w:hAnsi="楷体" w:eastAsia="楷体"/>
+          <w:rFonts w:ascii="宋体" w:hAnsi="宋体" w:eastAsia="宋体"/>
           <w:b w:val="0"/>
           <w:color w:val="000000"/>
           <w:sz w:val="26"/>
@@ -962,7 +962,7 @@
             <w:r/>
             <w:r>
               <w:rPr>
-                <w:rFonts w:ascii="楷体" w:hAnsi="楷体" w:eastAsia="楷体"/>
+                <w:rFonts w:ascii="宋体" w:hAnsi="宋体" w:eastAsia="宋体"/>
                 <w:b w:val="0"/>
                 <w:color w:val="000000"/>
                 <w:sz w:val="24"/>
@@ -1005,7 +1005,7 @@
             </w:r>
             <w:r>
               <w:rPr>
-                <w:rFonts w:ascii="楷体" w:hAnsi="楷体" w:eastAsia="楷体"/>
+                <w:rFonts w:ascii="宋体" w:hAnsi="宋体" w:eastAsia="宋体"/>
                 <w:b/>
                 <w:color w:val="000000"/>
                 <w:sz w:val="24"/>
@@ -1027,7 +1027,7 @@
             <w:r/>
             <w:r>
               <w:rPr>
-                <w:rFonts w:ascii="楷体" w:hAnsi="楷体" w:eastAsia="楷体"/>
+                <w:rFonts w:ascii="宋体" w:hAnsi="宋体" w:eastAsia="宋体"/>
                 <w:b w:val="0"/>
                 <w:color w:val="000000"/>
                 <w:sz w:val="24"/>
@@ -1070,7 +1070,7 @@
             </w:r>
             <w:r>
               <w:rPr>
-                <w:rFonts w:ascii="楷体" w:hAnsi="楷体" w:eastAsia="楷体"/>
+                <w:rFonts w:ascii="宋体" w:hAnsi="宋体" w:eastAsia="宋体"/>
                 <w:b/>
                 <w:color w:val="000000"/>
                 <w:sz w:val="24"/>
@@ -1092,7 +1092,7 @@
             <w:r/>
             <w:r>
               <w:rPr>
-                <w:rFonts w:ascii="楷体" w:hAnsi="楷体" w:eastAsia="楷体"/>
+                <w:rFonts w:ascii="宋体" w:hAnsi="宋体" w:eastAsia="宋体"/>
                 <w:b w:val="0"/>
                 <w:color w:val="000000"/>
                 <w:sz w:val="24"/>
@@ -1135,7 +1135,7 @@
             </w:r>
             <w:r>
               <w:rPr>
-                <w:rFonts w:ascii="楷体" w:hAnsi="楷体" w:eastAsia="楷体"/>
+                <w:rFonts w:ascii="宋体" w:hAnsi="宋体" w:eastAsia="宋体"/>
                 <w:b/>
                 <w:color w:val="000000"/>
                 <w:sz w:val="24"/>
@@ -1157,7 +1157,7 @@
             <w:r/>
             <w:r>
               <w:rPr>
-                <w:rFonts w:ascii="楷体" w:hAnsi="楷体" w:eastAsia="楷体"/>
+                <w:rFonts w:ascii="宋体" w:hAnsi="宋体" w:eastAsia="宋体"/>
                 <w:b w:val="0"/>
                 <w:color w:val="000000"/>
                 <w:sz w:val="24"/>
@@ -1200,7 +1200,7 @@
             </w:r>
             <w:r>
               <w:rPr>
-                <w:rFonts w:ascii="楷体" w:hAnsi="楷体" w:eastAsia="楷体"/>
+                <w:rFonts w:ascii="宋体" w:hAnsi="宋体" w:eastAsia="宋体"/>
                 <w:b/>
                 <w:color w:val="000000"/>
                 <w:sz w:val="24"/>
@@ -1222,7 +1222,7 @@
       </w:pPr>
       <w:r>
         <w:rPr>
-          <w:rFonts w:ascii="楷体" w:hAnsi="楷体" w:eastAsia="楷体"/>
+          <w:rFonts w:ascii="宋体" w:hAnsi="宋体" w:eastAsia="宋体"/>
           <w:b w:val="0"/>
           <w:color w:val="000000"/>
           <w:sz w:val="24"/>
@@ -1236,7 +1236,7 @@
       </w:pPr>
       <w:r>
         <w:rPr>
-          <w:rFonts w:ascii="楷体" w:hAnsi="楷体" w:eastAsia="楷体"/>
+          <w:rFonts w:ascii="宋体" w:hAnsi="宋体" w:eastAsia="宋体"/>
           <w:b w:val="0"/>
           <w:color w:val="000000"/>
           <w:sz w:val="26"/>
@@ -1261,7 +1261,7 @@
       </w:pPr>
       <w:r>
         <w:rPr>
-          <w:rFonts w:ascii="楷体" w:hAnsi="楷体" w:eastAsia="楷体"/>
+          <w:rFonts w:ascii="宋体" w:hAnsi="宋体" w:eastAsia="宋体"/>
           <w:b w:val="0"/>
           <w:color w:val="000000"/>
           <w:sz w:val="26"/>
@@ -1275,7 +1275,7 @@
       </w:pPr>
       <w:r>
         <w:rPr>
-          <w:rFonts w:ascii="楷体" w:hAnsi="楷体" w:eastAsia="楷体"/>
+          <w:rFonts w:ascii="宋体" w:hAnsi="宋体" w:eastAsia="宋体"/>
           <w:b w:val="0"/>
           <w:color w:val="000000"/>
           <w:sz w:val="26"/>
@@ -1289,7 +1289,7 @@
       </w:pPr>
       <w:r>
         <w:rPr>
-          <w:rFonts w:ascii="楷体" w:hAnsi="楷体" w:eastAsia="楷体"/>
+          <w:rFonts w:ascii="宋体" w:hAnsi="宋体" w:eastAsia="宋体"/>
           <w:b w:val="0"/>
           <w:color w:val="000000"/>
           <w:sz w:val="26"/>
@@ -1303,7 +1303,7 @@
       </w:pPr>
       <w:r>
         <w:rPr>
-          <w:rFonts w:ascii="楷体" w:hAnsi="楷体" w:eastAsia="楷体"/>
+          <w:rFonts w:ascii="宋体" w:hAnsi="宋体" w:eastAsia="宋体"/>
           <w:b w:val="0"/>
           <w:color w:val="000000"/>
           <w:sz w:val="26"/>
@@ -1317,7 +1317,7 @@
       </w:pPr>
       <w:r>
         <w:rPr>
-          <w:rFonts w:ascii="楷体" w:hAnsi="楷体" w:eastAsia="楷体"/>
+          <w:rFonts w:ascii="宋体" w:hAnsi="宋体" w:eastAsia="宋体"/>
           <w:b w:val="0"/>
           <w:color w:val="000000"/>
           <w:sz w:val="26"/>
@@ -1345,7 +1345,7 @@
       </w:pPr>
       <w:r>
         <w:rPr>
-          <w:rFonts w:ascii="楷体" w:hAnsi="楷体" w:eastAsia="楷体"/>
+          <w:rFonts w:ascii="宋体" w:hAnsi="宋体" w:eastAsia="宋体"/>
           <w:b w:val="0"/>
           <w:color w:val="000000"/>
           <w:sz w:val="26"/>
@@ -1359,7 +1359,7 @@
       </w:pPr>
       <w:r>
         <w:rPr>
-          <w:rFonts w:ascii="楷体" w:hAnsi="楷体" w:eastAsia="楷体"/>
+          <w:rFonts w:ascii="宋体" w:hAnsi="宋体" w:eastAsia="宋体"/>
           <w:b w:val="0"/>
           <w:color w:val="000000"/>
           <w:sz w:val="26"/>
@@ -1373,7 +1373,7 @@
       </w:pPr>
       <w:r>
         <w:rPr>
-          <w:rFonts w:ascii="楷体" w:hAnsi="楷体" w:eastAsia="楷体"/>
+          <w:rFonts w:ascii="宋体" w:hAnsi="宋体" w:eastAsia="宋体"/>
           <w:b w:val="0"/>
           <w:color w:val="000000"/>
           <w:sz w:val="26"/>
@@ -1387,7 +1387,7 @@
       </w:pPr>
       <w:r>
         <w:rPr>
-          <w:rFonts w:ascii="楷体" w:hAnsi="楷体" w:eastAsia="楷体"/>
+          <w:rFonts w:ascii="宋体" w:hAnsi="宋体" w:eastAsia="宋体"/>
           <w:b w:val="0"/>
           <w:color w:val="000000"/>
           <w:sz w:val="26"/>
@@ -1415,7 +1415,7 @@
       </w:pPr>
       <w:r>
         <w:rPr>
-          <w:rFonts w:ascii="楷体" w:hAnsi="楷体" w:eastAsia="楷体"/>
+          <w:rFonts w:ascii="宋体" w:hAnsi="宋体" w:eastAsia="宋体"/>
           <w:b w:val="0"/>
           <w:color w:val="000000"/>
           <w:sz w:val="26"/>
@@ -1429,7 +1429,7 @@
       </w:pPr>
       <w:r>
         <w:rPr>
-          <w:rFonts w:ascii="楷体" w:hAnsi="楷体" w:eastAsia="楷体"/>
+          <w:rFonts w:ascii="宋体" w:hAnsi="宋体" w:eastAsia="宋体"/>
           <w:b w:val="0"/>
           <w:color w:val="000000"/>
           <w:sz w:val="26"/>
@@ -1457,7 +1457,7 @@
       </w:pPr>
       <w:r>
         <w:rPr>
-          <w:rFonts w:ascii="楷体" w:hAnsi="楷体" w:eastAsia="楷体"/>
+          <w:rFonts w:ascii="宋体" w:hAnsi="宋体" w:eastAsia="宋体"/>
           <w:b/>
           <w:color w:val="000000"/>
           <w:sz w:val="26"/>
@@ -1472,7 +1472,7 @@
       </w:pPr>
       <w:r>
         <w:rPr>
-          <w:rFonts w:ascii="楷体" w:hAnsi="楷体" w:eastAsia="楷体"/>
+          <w:rFonts w:ascii="宋体" w:hAnsi="宋体" w:eastAsia="宋体"/>
           <w:b w:val="0"/>
           <w:color w:val="000000"/>
           <w:sz w:val="24"/>
@@ -1487,7 +1487,7 @@
       </w:pPr>
       <w:r>
         <w:rPr>
-          <w:rFonts w:ascii="楷体" w:hAnsi="楷体" w:eastAsia="楷体"/>
+          <w:rFonts w:ascii="宋体" w:hAnsi="宋体" w:eastAsia="宋体"/>
           <w:b w:val="0"/>
           <w:color w:val="000000"/>
           <w:sz w:val="24"/>
@@ -1502,7 +1502,7 @@
       </w:pPr>
       <w:r>
         <w:rPr>
-          <w:rFonts w:ascii="楷体" w:hAnsi="楷体" w:eastAsia="楷体"/>
+          <w:rFonts w:ascii="宋体" w:hAnsi="宋体" w:eastAsia="宋体"/>
           <w:b w:val="0"/>
           <w:color w:val="000000"/>
           <w:sz w:val="24"/>
@@ -1528,7 +1528,7 @@
       </w:pPr>
       <w:r>
         <w:rPr>
-          <w:rFonts w:ascii="楷体" w:hAnsi="楷体" w:eastAsia="楷体"/>
+          <w:rFonts w:ascii="宋体" w:hAnsi="宋体" w:eastAsia="宋体"/>
           <w:b w:val="0"/>
           <w:color w:val="000000"/>
           <w:sz w:val="24"/>
@@ -1542,7 +1542,7 @@
       </w:pPr>
       <w:r>
         <w:rPr>
-          <w:rFonts w:ascii="楷体" w:hAnsi="楷体" w:eastAsia="楷体"/>
+          <w:rFonts w:ascii="宋体" w:hAnsi="宋体" w:eastAsia="宋体"/>
           <w:b w:val="0"/>
           <w:color w:val="000000"/>
           <w:sz w:val="20"/>
@@ -1556,7 +1556,7 @@
       </w:pPr>
       <w:r>
         <w:rPr>
-          <w:rFonts w:ascii="楷体" w:hAnsi="楷体" w:eastAsia="楷体"/>
+          <w:rFonts w:ascii="宋体" w:hAnsi="宋体" w:eastAsia="宋体"/>
           <w:b w:val="0"/>
           <w:color w:val="000000"/>
           <w:sz w:val="26"/>
@@ -1570,7 +1570,7 @@
       </w:pPr>
       <w:r>
         <w:rPr>
-          <w:rFonts w:ascii="楷体" w:hAnsi="楷体" w:eastAsia="楷体"/>
+          <w:rFonts w:ascii="宋体" w:hAnsi="宋体" w:eastAsia="宋体"/>
           <w:b w:val="0"/>
           <w:color w:val="000000"/>
           <w:sz w:val="26"/>
@@ -1584,7 +1584,7 @@
       </w:pPr>
       <w:r>
         <w:rPr>
-          <w:rFonts w:ascii="楷体" w:hAnsi="楷体" w:eastAsia="楷体"/>
+          <w:rFonts w:ascii="宋体" w:hAnsi="宋体" w:eastAsia="宋体"/>
           <w:b w:val="0"/>
           <w:color w:val="000000"/>
           <w:sz w:val="26"/>
@@ -1598,7 +1598,7 @@
       </w:pPr>
       <w:r>
         <w:rPr>
-          <w:rFonts w:ascii="楷体" w:hAnsi="楷体" w:eastAsia="楷体"/>
+          <w:rFonts w:ascii="宋体" w:hAnsi="宋体" w:eastAsia="宋体"/>
           <w:b w:val="0"/>
           <w:color w:val="000000"/>
           <w:sz w:val="26"/>
@@ -1612,7 +1612,7 @@
       </w:pPr>
       <w:r>
         <w:rPr>
-          <w:rFonts w:ascii="楷体" w:hAnsi="楷体" w:eastAsia="楷体"/>
+          <w:rFonts w:ascii="宋体" w:hAnsi="宋体" w:eastAsia="宋体"/>
           <w:b w:val="0"/>
           <w:color w:val="000000"/>
           <w:sz w:val="26"/>
@@ -1626,7 +1626,7 @@
       </w:pPr>
       <w:r>
         <w:rPr>
-          <w:rFonts w:ascii="楷体" w:hAnsi="楷体" w:eastAsia="楷体"/>
+          <w:rFonts w:ascii="宋体" w:hAnsi="宋体" w:eastAsia="宋体"/>
           <w:b w:val="0"/>
           <w:color w:val="000000"/>
           <w:sz w:val="26"/>
@@ -1640,7 +1640,7 @@
       </w:pPr>
       <w:r>
         <w:rPr>
-          <w:rFonts w:ascii="楷体" w:hAnsi="楷体" w:eastAsia="楷体"/>
+          <w:rFonts w:ascii="宋体" w:hAnsi="宋体" w:eastAsia="宋体"/>
           <w:b w:val="0"/>
           <w:color w:val="000000"/>
           <w:sz w:val="26"/>
@@ -1654,7 +1654,7 @@
       </w:pPr>
       <w:r>
         <w:rPr>
-          <w:rFonts w:ascii="楷体" w:hAnsi="楷体" w:eastAsia="楷体"/>
+          <w:rFonts w:ascii="宋体" w:hAnsi="宋体" w:eastAsia="宋体"/>
           <w:b w:val="0"/>
           <w:color w:val="000000"/>
           <w:sz w:val="26"/>
@@ -1668,7 +1668,7 @@
       </w:pPr>
       <w:r>
         <w:rPr>
-          <w:rFonts w:ascii="楷体" w:hAnsi="楷体" w:eastAsia="楷体"/>
+          <w:rFonts w:ascii="宋体" w:hAnsi="宋体" w:eastAsia="宋体"/>
           <w:b w:val="0"/>
           <w:color w:val="000000"/>
           <w:sz w:val="26"/>
@@ -1682,7 +1682,7 @@
       </w:pPr>
       <w:r>
         <w:rPr>
-          <w:rFonts w:ascii="楷体" w:hAnsi="楷体" w:eastAsia="楷体"/>
+          <w:rFonts w:ascii="宋体" w:hAnsi="宋体" w:eastAsia="宋体"/>
           <w:b w:val="0"/>
           <w:color w:val="000000"/>
           <w:sz w:val="30"/>
@@ -1696,7 +1696,7 @@
       </w:pPr>
       <w:r>
         <w:rPr>
-          <w:rFonts w:ascii="楷体" w:hAnsi="楷体" w:eastAsia="楷体"/>
+          <w:rFonts w:ascii="宋体" w:hAnsi="宋体" w:eastAsia="宋体"/>
           <w:b w:val="0"/>
           <w:color w:val="000000"/>
           <w:sz w:val="30"/>
@@ -1710,7 +1710,7 @@
       </w:pPr>
       <w:r>
         <w:rPr>
-          <w:rFonts w:ascii="楷体" w:hAnsi="楷体" w:eastAsia="楷体"/>
+          <w:rFonts w:ascii="宋体" w:hAnsi="宋体" w:eastAsia="宋体"/>
           <w:b/>
           <w:color w:val="000000"/>
           <w:sz w:val="26"/>
@@ -1725,7 +1725,7 @@
       </w:pPr>
       <w:r>
         <w:rPr>
-          <w:rFonts w:ascii="楷体" w:hAnsi="楷体" w:eastAsia="楷体"/>
+          <w:rFonts w:ascii="宋体" w:hAnsi="宋体" w:eastAsia="宋体"/>
           <w:b w:val="0"/>
           <w:color w:val="000000"/>
           <w:sz w:val="24"/>
@@ -1740,7 +1740,7 @@
       </w:pPr>
       <w:r>
         <w:rPr>
-          <w:rFonts w:ascii="楷体" w:hAnsi="楷体" w:eastAsia="楷体"/>
+          <w:rFonts w:ascii="宋体" w:hAnsi="宋体" w:eastAsia="宋体"/>
           <w:b w:val="0"/>
           <w:color w:val="000000"/>
           <w:sz w:val="24"/>
@@ -1766,7 +1766,7 @@
       </w:pPr>
       <w:r>
         <w:rPr>
-          <w:rFonts w:ascii="楷体" w:hAnsi="楷体" w:eastAsia="楷体"/>
+          <w:rFonts w:ascii="宋体" w:hAnsi="宋体" w:eastAsia="宋体"/>
           <w:b w:val="0"/>
           <w:color w:val="000000"/>
           <w:sz w:val="24"/>
@@ -1781,7 +1781,7 @@
       </w:pPr>
       <w:r>
         <w:rPr>
-          <w:rFonts w:ascii="楷体" w:hAnsi="楷体" w:eastAsia="楷体"/>
+          <w:rFonts w:ascii="宋体" w:hAnsi="宋体" w:eastAsia="宋体"/>
           <w:b w:val="0"/>
           <w:color w:val="000000"/>
           <w:sz w:val="24"/>
@@ -1795,7 +1795,7 @@
       </w:pPr>
       <w:r>
         <w:rPr>
-          <w:rFonts w:ascii="楷体" w:hAnsi="楷体" w:eastAsia="楷体"/>
+          <w:rFonts w:ascii="宋体" w:hAnsi="宋体" w:eastAsia="宋体"/>
           <w:b w:val="0"/>
           <w:color w:val="000000"/>
           <w:sz w:val="20"/>
@@ -1809,7 +1809,7 @@
       </w:pPr>
       <w:r>
         <w:rPr>
-          <w:rFonts w:ascii="楷体" w:hAnsi="楷体" w:eastAsia="楷体"/>
+          <w:rFonts w:ascii="宋体" w:hAnsi="宋体" w:eastAsia="宋体"/>
           <w:b w:val="0"/>
           <w:color w:val="000000"/>
           <w:sz w:val="26"/>
@@ -1823,7 +1823,7 @@
       </w:pPr>
       <w:r>
         <w:rPr>
-          <w:rFonts w:ascii="楷体" w:hAnsi="楷体" w:eastAsia="楷体"/>
+          <w:rFonts w:ascii="宋体" w:hAnsi="宋体" w:eastAsia="宋体"/>
           <w:b w:val="0"/>
           <w:color w:val="000000"/>
           <w:sz w:val="26"/>
@@ -1837,7 +1837,7 @@
       </w:pPr>
       <w:r>
         <w:rPr>
-          <w:rFonts w:ascii="楷体" w:hAnsi="楷体" w:eastAsia="楷体"/>
+          <w:rFonts w:ascii="宋体" w:hAnsi="宋体" w:eastAsia="宋体"/>
           <w:b w:val="0"/>
           <w:color w:val="000000"/>
           <w:sz w:val="24"/>
@@ -1851,7 +1851,7 @@
       </w:pPr>
       <w:r>
         <w:rPr>
-          <w:rFonts w:ascii="楷体" w:hAnsi="楷体" w:eastAsia="楷体"/>
+          <w:rFonts w:ascii="宋体" w:hAnsi="宋体" w:eastAsia="宋体"/>
           <w:b w:val="0"/>
           <w:color w:val="000000"/>
           <w:sz w:val="30"/>
@@ -1865,7 +1865,7 @@
       </w:pPr>
       <w:r>
         <w:rPr>
-          <w:rFonts w:ascii="楷体" w:hAnsi="楷体" w:eastAsia="楷体"/>
+          <w:rFonts w:ascii="宋体" w:hAnsi="宋体" w:eastAsia="宋体"/>
           <w:b w:val="0"/>
           <w:color w:val="000000"/>
           <w:sz w:val="30"/>
@@ -1879,7 +1879,7 @@
       </w:pPr>
       <w:r>
         <w:rPr>
-          <w:rFonts w:ascii="楷体" w:hAnsi="楷体" w:eastAsia="楷体"/>
+          <w:rFonts w:ascii="宋体" w:hAnsi="宋体" w:eastAsia="宋体"/>
           <w:b w:val="0"/>
           <w:color w:val="000000"/>
           <w:sz w:val="26"/>
@@ -1938,7 +1938,7 @@
             <w:r/>
             <w:r>
               <w:rPr>
-                <w:rFonts w:ascii="楷体" w:hAnsi="楷体" w:eastAsia="楷体"/>
+                <w:rFonts w:ascii="宋体" w:hAnsi="宋体" w:eastAsia="宋体"/>
                 <w:b w:val="0"/>
                 <w:color w:val="000000"/>
                 <w:sz w:val="24"/>
@@ -1989,7 +1989,7 @@
             <w:r/>
             <w:r>
               <w:rPr>
-                <w:rFonts w:ascii="楷体" w:hAnsi="楷体" w:eastAsia="楷体"/>
+                <w:rFonts w:ascii="宋体" w:hAnsi="宋体" w:eastAsia="宋体"/>
                 <w:b w:val="0"/>
                 <w:color w:val="000000"/>
                 <w:sz w:val="24"/>
@@ -2040,7 +2040,7 @@
             <w:r/>
             <w:r>
               <w:rPr>
-                <w:rFonts w:ascii="楷体" w:hAnsi="楷体" w:eastAsia="楷体"/>
+                <w:rFonts w:ascii="宋体" w:hAnsi="宋体" w:eastAsia="宋体"/>
                 <w:b w:val="0"/>
                 <w:color w:val="000000"/>
                 <w:sz w:val="24"/>
@@ -2091,7 +2091,7 @@
             <w:r/>
             <w:r>
               <w:rPr>
-                <w:rFonts w:ascii="楷体" w:hAnsi="楷体" w:eastAsia="楷体"/>
+                <w:rFonts w:ascii="宋体" w:hAnsi="宋体" w:eastAsia="宋体"/>
                 <w:b w:val="0"/>
                 <w:color w:val="000000"/>
                 <w:sz w:val="24"/>
@@ -2113,7 +2113,7 @@
       </w:pPr>
       <w:r>
         <w:rPr>
-          <w:rFonts w:ascii="楷体" w:hAnsi="楷体" w:eastAsia="楷体"/>
+          <w:rFonts w:ascii="宋体" w:hAnsi="宋体" w:eastAsia="宋体"/>
           <w:b w:val="0"/>
           <w:color w:val="000000"/>
           <w:sz w:val="24"/>
@@ -2127,7 +2127,7 @@
       </w:pPr>
       <w:r>
         <w:rPr>
-          <w:rFonts w:ascii="楷体" w:hAnsi="楷体" w:eastAsia="楷体"/>
+          <w:rFonts w:ascii="宋体" w:hAnsi="宋体" w:eastAsia="宋体"/>
           <w:b w:val="0"/>
           <w:color w:val="000000"/>
           <w:sz w:val="30"/>
@@ -2141,7 +2141,7 @@
       </w:pPr>
       <w:r>
         <w:rPr>
-          <w:rFonts w:ascii="楷体" w:hAnsi="楷体" w:eastAsia="楷体"/>
+          <w:rFonts w:ascii="宋体" w:hAnsi="宋体" w:eastAsia="宋体"/>
           <w:b w:val="0"/>
           <w:color w:val="000000"/>
           <w:sz w:val="30"/>
@@ -2170,7 +2170,7 @@
     </w:pPr>
     <w:r>
       <w:rPr>
-        <w:rFonts w:ascii="楷体" w:hAnsi="楷体" w:eastAsia="楷体"/>
+        <w:rFonts w:ascii="宋体" w:hAnsi="宋体" w:eastAsia="宋体"/>
         <w:b w:val="0"/>
         <w:color w:val="000000"/>
         <w:sz w:val="18"/>
@@ -2191,7 +2191,7 @@
     </w:pPr>
     <w:r>
       <w:rPr>
-        <w:rFonts w:ascii="楷体" w:hAnsi="楷体" w:eastAsia="楷体"/>
+        <w:rFonts w:ascii="宋体" w:hAnsi="宋体" w:eastAsia="宋体"/>
         <w:b w:val="0"/>
         <w:color w:val="000000"/>
         <w:sz w:val="18"/>
@@ -2212,7 +2212,7 @@
     </w:pPr>
     <w:r>
       <w:rPr>
-        <w:rFonts w:ascii="楷体" w:hAnsi="楷体" w:eastAsia="楷体"/>
+        <w:rFonts w:ascii="宋体" w:hAnsi="宋体" w:eastAsia="宋体"/>
         <w:b w:val="0"/>
         <w:color w:val="000000"/>
         <w:sz w:val="18"/>
@@ -2233,7 +2233,7 @@
     </w:pPr>
     <w:r>
       <w:rPr>
-        <w:rFonts w:ascii="楷体" w:hAnsi="楷体" w:eastAsia="楷体"/>
+        <w:rFonts w:ascii="宋体" w:hAnsi="宋体" w:eastAsia="宋体"/>
         <w:b w:val="0"/>
         <w:color w:val="000000"/>
         <w:sz w:val="18"/>
@@ -2608,7 +2608,7 @@
     <w:qFormat/>
     <w:rsid w:val="00FC693F"/>
     <w:rPr>
-      <w:rFonts w:ascii="楷体" w:hAnsi="楷体" w:eastAsia="楷体" w:cs="楷体"/>
+      <w:rFonts w:ascii="宋体" w:hAnsi="宋体" w:eastAsia="宋体" w:cs="宋体"/>
       <w:color w:val="000000"/>
       <w:sz w:val="26"/>
     </w:rPr>

</xml_diff>